<commit_message>
WP19: remove early cross-validation and parameter tuning from Exercises 1-4
Exercise 3 fixes k = 20 and Exercise 4 fixes C = 1.0 as predeclared
worked-example parameters, removing the training-only cross-validation /
GridSearchCV selection lessons and every "selected/optimal/best" claim tied
to validation performance. Interactive exploration (knn-explore, knn-abc,
classification-threshold, classification-imbalance) is preserved but no
longer implies parameter selection; widget defaults now use the fixed
worked-example values. Exercises 1-2 keep their analyses/results unchanged,
with two passing forward-references to "cross-validation" reworded. Course
overview DOCX updated to describe the fixed k/C and each table row is
marked cantSplit. Audit scripts, export scripts, config, and tests updated
to match; portable notebooks regenerated.

Co-Authored-By: Claude Sonnet 5 <noreply@anthropic.com>
</commit_message>
<xml_diff>
--- a/course_overview/Machine_Learning_for_Neuroscience_Notebook_Overview.docx
+++ b/course_overview/Machine_Learning_for_Neuroscience_Notebook_Overview.docx
@@ -4,6 +4,7 @@
   <w:body>
     <w:p>
       <w:pPr>
+        <w:spacing w:before="0" w:after="80"/>
         <w:jc w:val="left"/>
       </w:pPr>
       <w:r>
@@ -16,6 +17,9 @@
       </w:r>
     </w:p>
     <w:p>
+      <w:pPr>
+        <w:spacing w:before="0" w:after="160"/>
+      </w:pPr>
       <w:r>
         <w:rPr>
           <w:sz w:val="24"/>
@@ -23,7 +27,6 @@
         <w:t>This document summarizes the practice notebooks currently developed for the course, one row per exercise.</w:t>
       </w:r>
     </w:p>
-    <w:p/>
     <w:tbl>
       <w:tblPr>
         <w:tblStyle w:val="TableGrid"/>
@@ -38,6 +41,9 @@
         <w:gridCol w:w="4608"/>
       </w:tblGrid>
       <w:tr>
+        <w:trPr>
+          <w:cantSplit/>
+        </w:trPr>
         <w:tc>
           <w:tcPr>
             <w:tcW w:type="dxa" w:w="1440"/>
@@ -45,6 +51,9 @@
             <w:vAlign w:val="center"/>
           </w:tcPr>
           <w:p>
+            <w:pPr>
+              <w:spacing w:before="0" w:after="80"/>
+            </w:pPr>
             <w:r/>
             <w:r>
               <w:rPr>
@@ -63,6 +72,9 @@
             <w:vAlign w:val="center"/>
           </w:tcPr>
           <w:p>
+            <w:pPr>
+              <w:spacing w:before="0" w:after="80"/>
+            </w:pPr>
             <w:r/>
             <w:r>
               <w:rPr>
@@ -81,6 +93,9 @@
             <w:vAlign w:val="center"/>
           </w:tcPr>
           <w:p>
+            <w:pPr>
+              <w:spacing w:before="0" w:after="80"/>
+            </w:pPr>
             <w:r/>
             <w:r>
               <w:rPr>
@@ -94,12 +109,18 @@
         </w:tc>
       </w:tr>
       <w:tr>
+        <w:trPr>
+          <w:cantSplit/>
+        </w:trPr>
         <w:tc>
           <w:tcPr>
             <w:tcW w:type="dxa" w:w="1440"/>
             <w:vAlign w:val="center"/>
           </w:tcPr>
           <w:p>
+            <w:pPr>
+              <w:spacing w:before="0" w:after="80"/>
+            </w:pPr>
             <w:r/>
             <w:r>
               <w:rPr>
@@ -115,6 +136,9 @@
             <w:vAlign w:val="center"/>
           </w:tcPr>
           <w:p>
+            <w:pPr>
+              <w:spacing w:before="0" w:after="80"/>
+            </w:pPr>
             <w:r/>
             <w:r>
               <w:rPr>
@@ -130,6 +154,9 @@
             <w:vAlign w:val="center"/>
           </w:tcPr>
           <w:p>
+            <w:pPr>
+              <w:spacing w:before="0" w:after="80"/>
+            </w:pPr>
             <w:r/>
             <w:r>
               <w:rPr>
@@ -141,12 +168,18 @@
         </w:tc>
       </w:tr>
       <w:tr>
+        <w:trPr>
+          <w:cantSplit/>
+        </w:trPr>
         <w:tc>
           <w:tcPr>
             <w:tcW w:type="dxa" w:w="1440"/>
             <w:vAlign w:val="center"/>
           </w:tcPr>
           <w:p>
+            <w:pPr>
+              <w:spacing w:before="0" w:after="80"/>
+            </w:pPr>
             <w:r/>
             <w:r>
               <w:rPr>
@@ -162,6 +195,9 @@
             <w:vAlign w:val="center"/>
           </w:tcPr>
           <w:p>
+            <w:pPr>
+              <w:spacing w:before="0" w:after="80"/>
+            </w:pPr>
             <w:r/>
             <w:r>
               <w:rPr>
@@ -177,6 +213,9 @@
             <w:vAlign w:val="center"/>
           </w:tcPr>
           <w:p>
+            <w:pPr>
+              <w:spacing w:before="0" w:after="80"/>
+            </w:pPr>
             <w:r/>
             <w:r>
               <w:rPr>
@@ -188,12 +227,18 @@
         </w:tc>
       </w:tr>
       <w:tr>
+        <w:trPr>
+          <w:cantSplit/>
+        </w:trPr>
         <w:tc>
           <w:tcPr>
             <w:tcW w:type="dxa" w:w="1440"/>
             <w:vAlign w:val="center"/>
           </w:tcPr>
           <w:p>
+            <w:pPr>
+              <w:spacing w:before="0" w:after="80"/>
+            </w:pPr>
             <w:r/>
             <w:r>
               <w:rPr>
@@ -209,6 +254,9 @@
             <w:vAlign w:val="center"/>
           </w:tcPr>
           <w:p>
+            <w:pPr>
+              <w:spacing w:before="0" w:after="80"/>
+            </w:pPr>
             <w:r/>
             <w:r>
               <w:rPr>
@@ -224,23 +272,32 @@
             <w:vAlign w:val="center"/>
           </w:tcPr>
           <w:p>
+            <w:pPr>
+              <w:spacing w:before="0" w:after="80"/>
+            </w:pPr>
             <w:r/>
             <w:r>
               <w:rPr>
                 <w:sz w:val="24"/>
               </w:rPr>
-              <w:t>KNN regression for age prediction; scaling inside a Pipeline; choosing k honestly via training-only 5-fold cross-validation; honest versus invalid evaluation (interactive activity); the classic bias–variance tradeoff; empirical k = 1..N_fit curve; explore-k interactive activity.</w:t>
+              <w:t>KNN regression for age prediction; scaling inside a Pipeline; worked model uses a preselected k = 20, fixed by course design; honest versus invalid evaluation (interactive activity); the classic bias–variance tradeoff; empirical k = 1..N_fit curve; explore-k interactive activity.</w:t>
             </w:r>
           </w:p>
         </w:tc>
       </w:tr>
       <w:tr>
+        <w:trPr>
+          <w:cantSplit/>
+        </w:trPr>
         <w:tc>
           <w:tcPr>
             <w:tcW w:type="dxa" w:w="1440"/>
             <w:vAlign w:val="center"/>
           </w:tcPr>
           <w:p>
+            <w:pPr>
+              <w:spacing w:before="0" w:after="80"/>
+            </w:pPr>
             <w:r/>
             <w:r>
               <w:rPr>
@@ -256,6 +313,9 @@
             <w:vAlign w:val="center"/>
           </w:tcPr>
           <w:p>
+            <w:pPr>
+              <w:spacing w:before="0" w:after="80"/>
+            </w:pPr>
             <w:r/>
             <w:r>
               <w:rPr>
@@ -271,12 +331,15 @@
             <w:vAlign w:val="center"/>
           </w:tcPr>
           <w:p>
+            <w:pPr>
+              <w:spacing w:before="0" w:after="80"/>
+            </w:pPr>
             <w:r/>
             <w:r>
               <w:rPr>
                 <w:sz w:val="24"/>
               </w:rPr>
-              <w:t>ABIDE autism-versus-control classification (360 ROI predictors); logistic regression and the sigmoid function; choosing C honestly via training-only cross-validation scored by ROC AUC; confusion matrix labelled with TN, FP, FN, TP; accuracy, sensitivity, specificity, ROC/AUC; decision-threshold interactive activity; class imbalance and misleading accuracy (interactive activity).</w:t>
+              <w:t>ABIDE autism-versus-control classification (360 ROI predictors); logistic regression and the sigmoid function; worked model uses a fixed C = 1.0, fixed by course design; confusion matrix labelled with TN, FP, FN, TP; accuracy, sensitivity, specificity, ROC/AUC; decision-threshold interactive activity; class imbalance and misleading accuracy (interactive activity).</w:t>
             </w:r>
           </w:p>
         </w:tc>

</xml_diff>